<commit_message>
Add accepted Zoosystema paper (Hounmavo et al., in press) to site and CV
</commit_message>
<xml_diff>
--- a/cv/reference.docx
+++ b/cv/reference.docx
@@ -6,7 +6,7 @@
     <w:sectPr>
       <w:footerReference w:type="default" r:id="rId9"/>
       <w:pgSz w:w="11909" w:h="16834"/>
-      <w:pgMar w:top="864" w:right="1037" w:bottom="864" w:left="1037" w:header="720" w:footer="504" w:gutter="0"/>
+      <w:pgMar w:top="936" w:right="1080" w:bottom="1080" w:left="1080" w:header="720" w:footer="576" w:gutter="0"/>
       <w:cols w:space="720"/>
       <w:docGrid w:linePitch="360"/>
     </w:sectPr>
@@ -19,70 +19,125 @@
   <w:p>
     <w:pPr>
       <w:pStyle w:val="Footer"/>
+      <w:pBdr>
+        <w:top w:val="single" w:sz="4" w:space="4" w:color="D2C49C"/>
+      </w:pBdr>
+      <w:tabs>
+        <w:tab w:pos="4680" w:val="clear"/>
+        <w:tab w:pos="9360" w:val="clear"/>
+        <w:tab w:pos="9749" w:val="right"/>
+      </w:tabs>
       <w:spacing w:before="0" w:after="0"/>
-      <w:jc w:val="center"/>
     </w:pPr>
     <w:r>
       <w:rPr>
         <w:rFonts w:ascii="Calibri" w:hAnsi="Calibri" w:cs="Calibri"/>
-        <w:color w:val="7A7263"/>
-        <w:sz w:val="16"/>
-      </w:rPr>
-      <w:t xml:space="preserve">Kenneth Otieno Onditi  ·  Curriculum Vitae  ·  </w:t>
+        <w:color w:val="6E6757"/>
+        <w:sz w:val="17"/>
+      </w:rPr>
+      <w:t xml:space="preserve">Kenneth Otieno Onditi  ·  Curriculum Vitae</w:t>
     </w:r>
     <w:r>
       <w:rPr>
-        <w:rFonts w:ascii="Calibri" w:hAnsi="Calibri"/>
-        <w:sz w:val="16"/>
-        <w:color w:val="7A7263"/>
+        <w:rFonts w:ascii="Calibri" w:hAnsi="Calibri" w:cs="Calibri"/>
+        <w:color w:val="6E6757"/>
+        <w:sz w:val="17"/>
+      </w:rPr>
+      <w:tab/>
+    </w:r>
+    <w:r>
+      <w:rPr>
+        <w:rFonts w:ascii="Calibri" w:hAnsi="Calibri" w:cs="Calibri"/>
+        <w:color w:val="6E6757"/>
+        <w:sz w:val="17"/>
+      </w:rPr>
+      <w:t xml:space="preserve">Page </w:t>
+    </w:r>
+    <w:r>
+      <w:rPr>
+        <w:rFonts w:ascii="Calibri" w:hAnsi="Calibri" w:cs="Calibri"/>
+        <w:color w:val="6E6757"/>
+        <w:sz w:val="17"/>
       </w:rPr>
       <w:fldChar w:fldCharType="begin"/>
     </w:r>
     <w:r>
       <w:rPr>
-        <w:rFonts w:ascii="Calibri" w:hAnsi="Calibri"/>
-        <w:sz w:val="16"/>
-        <w:color w:val="7A7263"/>
-      </w:rPr>
-      <w:instrText xml:space="preserve">PAGE</w:instrText>
+        <w:rFonts w:ascii="Calibri" w:hAnsi="Calibri" w:cs="Calibri"/>
+        <w:color w:val="6E6757"/>
+        <w:sz w:val="17"/>
+      </w:rPr>
+      <w:instrText xml:space="preserve"> PAGE </w:instrText>
     </w:r>
     <w:r>
       <w:rPr>
-        <w:rFonts w:ascii="Calibri" w:hAnsi="Calibri"/>
-        <w:sz w:val="16"/>
-        <w:color w:val="7A7263"/>
+        <w:rFonts w:ascii="Calibri" w:hAnsi="Calibri" w:cs="Calibri"/>
+        <w:color w:val="6E6757"/>
+        <w:sz w:val="17"/>
+      </w:rPr>
+      <w:fldChar w:fldCharType="separate"/>
+    </w:r>
+    <w:r>
+      <w:rPr>
+        <w:rFonts w:ascii="Calibri" w:hAnsi="Calibri" w:cs="Calibri"/>
+        <w:color w:val="6E6757"/>
+        <w:sz w:val="17"/>
+      </w:rPr>
+      <w:t xml:space="preserve">1</w:t>
+    </w:r>
+    <w:r>
+      <w:rPr>
+        <w:rFonts w:ascii="Calibri" w:hAnsi="Calibri" w:cs="Calibri"/>
+        <w:color w:val="6E6757"/>
+        <w:sz w:val="17"/>
       </w:rPr>
       <w:fldChar w:fldCharType="end"/>
     </w:r>
     <w:r>
       <w:rPr>
         <w:rFonts w:ascii="Calibri" w:hAnsi="Calibri" w:cs="Calibri"/>
-        <w:color w:val="7A7263"/>
-        <w:sz w:val="16"/>
+        <w:color w:val="6E6757"/>
+        <w:sz w:val="17"/>
       </w:rPr>
       <w:t xml:space="preserve"> of </w:t>
     </w:r>
     <w:r>
       <w:rPr>
-        <w:rFonts w:ascii="Calibri" w:hAnsi="Calibri"/>
-        <w:sz w:val="16"/>
-        <w:color w:val="7A7263"/>
+        <w:rFonts w:ascii="Calibri" w:hAnsi="Calibri" w:cs="Calibri"/>
+        <w:color w:val="6E6757"/>
+        <w:sz w:val="17"/>
       </w:rPr>
       <w:fldChar w:fldCharType="begin"/>
     </w:r>
     <w:r>
       <w:rPr>
-        <w:rFonts w:ascii="Calibri" w:hAnsi="Calibri"/>
-        <w:sz w:val="16"/>
-        <w:color w:val="7A7263"/>
-      </w:rPr>
-      <w:instrText xml:space="preserve">NUMPAGES</w:instrText>
+        <w:rFonts w:ascii="Calibri" w:hAnsi="Calibri" w:cs="Calibri"/>
+        <w:color w:val="6E6757"/>
+        <w:sz w:val="17"/>
+      </w:rPr>
+      <w:instrText xml:space="preserve"> NUMPAGES </w:instrText>
     </w:r>
     <w:r>
       <w:rPr>
-        <w:rFonts w:ascii="Calibri" w:hAnsi="Calibri"/>
-        <w:sz w:val="16"/>
-        <w:color w:val="7A7263"/>
+        <w:rFonts w:ascii="Calibri" w:hAnsi="Calibri" w:cs="Calibri"/>
+        <w:color w:val="6E6757"/>
+        <w:sz w:val="17"/>
+      </w:rPr>
+      <w:fldChar w:fldCharType="separate"/>
+    </w:r>
+    <w:r>
+      <w:rPr>
+        <w:rFonts w:ascii="Calibri" w:hAnsi="Calibri" w:cs="Calibri"/>
+        <w:color w:val="6E6757"/>
+        <w:sz w:val="17"/>
+      </w:rPr>
+      <w:t xml:space="preserve">1</w:t>
+    </w:r>
+    <w:r>
+      <w:rPr>
+        <w:rFonts w:ascii="Calibri" w:hAnsi="Calibri" w:cs="Calibri"/>
+        <w:color w:val="6E6757"/>
+        <w:sz w:val="17"/>
       </w:rPr>
       <w:fldChar w:fldCharType="end"/>
     </w:r>
@@ -458,7 +513,7 @@
     </w:pPr>
     <w:rPr>
       <w:rFonts w:ascii="Calibri" w:hAnsi="Calibri" w:cs="Calibri"/>
-      <w:sz w:val="19"/>
+      <w:sz w:val="20"/>
     </w:rPr>
   </w:style>
   <w:style w:type="paragraph" w:styleId="Header">
@@ -894,7 +949,7 @@
     </w:pPr>
     <w:rPr>
       <w:rFonts w:ascii="Calibri" w:hAnsi="Calibri" w:cs="Calibri"/>
-      <w:sz w:val="19"/>
+      <w:sz w:val="20"/>
     </w:rPr>
   </w:style>
   <w:style w:type="character" w:customStyle="1" w:styleId="BodyTextChar">
@@ -12154,7 +12209,7 @@
     </w:pPr>
     <w:rPr>
       <w:rFonts w:ascii="Calibri" w:hAnsi="Calibri" w:cs="Calibri"/>
-      <w:sz w:val="19"/>
+      <w:sz w:val="20"/>
     </w:rPr>
   </w:style>
   <w:style w:type="paragraph" w:customStyle="1" w:styleId="Compact">
@@ -12164,7 +12219,7 @@
     </w:pPr>
     <w:rPr>
       <w:rFonts w:ascii="Calibri" w:hAnsi="Calibri" w:cs="Calibri"/>
-      <w:sz w:val="19"/>
+      <w:sz w:val="20"/>
     </w:rPr>
   </w:style>
   <w:style w:type="paragraph" w:customStyle="1" w:styleId="CVName">
@@ -12177,12 +12232,12 @@
       <w:spacing w:before="0" w:after="20" w:line="240" w:lineRule="auto"/>
     </w:pPr>
     <w:rPr>
-      <w:rFonts w:ascii="Georgia" w:hAnsi="Georgia" w:cs="Georgia"/>
+      <w:rFonts w:ascii="Cambria" w:hAnsi="Cambria" w:cs="Cambria"/>
       <w:b/>
       <w:caps/>
       <w:color w:val="1A1712"/>
-      <w:sz w:val="38"/>
-      <w:spacing w:val="32"/>
+      <w:spacing w:val="28"/>
+      <w:sz w:val="48"/>
     </w:rPr>
   </w:style>
   <w:style w:type="paragraph" w:customStyle="1" w:styleId="CVTitle">
@@ -12192,13 +12247,13 @@
     <w:pPr>
       <w:keepLines/>
       <w:widowControl/>
-      <w:spacing w:before="0" w:after="60" w:line="240" w:lineRule="auto"/>
+      <w:spacing w:before="0" w:after="80" w:line="240" w:lineRule="auto"/>
     </w:pPr>
     <w:rPr>
-      <w:rFonts w:ascii="Georgia" w:hAnsi="Georgia" w:cs="Georgia"/>
+      <w:rFonts w:ascii="Cambria" w:hAnsi="Cambria" w:cs="Cambria"/>
       <w:i/>
       <w:color w:val="8A6520"/>
-      <w:sz w:val="20"/>
+      <w:sz w:val="22"/>
     </w:rPr>
   </w:style>
   <w:style w:type="paragraph" w:customStyle="1" w:styleId="CVAffil">
@@ -12212,8 +12267,8 @@
     </w:pPr>
     <w:rPr>
       <w:rFonts w:ascii="Calibri" w:hAnsi="Calibri" w:cs="Calibri"/>
-      <w:color w:val="5A5347"/>
-      <w:sz w:val="17"/>
+      <w:color w:val="4F493E"/>
+      <w:sz w:val="19"/>
     </w:rPr>
   </w:style>
   <w:style w:type="paragraph" w:customStyle="1" w:styleId="CVContact">
@@ -12227,8 +12282,8 @@
     </w:pPr>
     <w:rPr>
       <w:rFonts w:ascii="Calibri" w:hAnsi="Calibri" w:cs="Calibri"/>
-      <w:color w:val="5A5347"/>
-      <w:sz w:val="17"/>
+      <w:color w:val="4F493E"/>
+      <w:sz w:val="18"/>
     </w:rPr>
   </w:style>
   <w:style w:type="paragraph" w:customStyle="1" w:styleId="CVLinks">
@@ -12238,15 +12293,15 @@
     <w:pPr>
       <w:keepLines/>
       <w:widowControl/>
+      <w:pBdr>
+        <w:bottom w:val="single" w:sz="8" w:space="7" w:color="8A6520"/>
+      </w:pBdr>
       <w:spacing w:before="0" w:after="0" w:line="240" w:lineRule="auto"/>
-      <w:pBdr>
-        <w:bottom w:val="single" w:sz="10" w:space="6" w:color="8A6520"/>
-      </w:pBdr>
     </w:pPr>
     <w:rPr>
       <w:rFonts w:ascii="Calibri" w:hAnsi="Calibri" w:cs="Calibri"/>
-      <w:color w:val="5A5347"/>
-      <w:sz w:val="17"/>
+      <w:color w:val="4F493E"/>
+      <w:sz w:val="18"/>
     </w:rPr>
   </w:style>
   <w:style w:type="paragraph" w:customStyle="1" w:styleId="CVSection">
@@ -12257,18 +12312,18 @@
       <w:keepNext/>
       <w:keepLines/>
       <w:widowControl/>
-      <w:spacing w:before="220" w:after="80" w:line="240" w:lineRule="auto"/>
       <w:pBdr>
-        <w:bottom w:val="single" w:sz="4" w:space="2" w:color="C9B98E"/>
+        <w:bottom w:val="single" w:sz="4" w:space="2" w:color="D2C49C"/>
       </w:pBdr>
+      <w:spacing w:before="280" w:after="100" w:line="240" w:lineRule="auto"/>
     </w:pPr>
     <w:rPr>
-      <w:rFonts w:ascii="Georgia" w:hAnsi="Georgia" w:cs="Georgia"/>
+      <w:rFonts w:ascii="Cambria" w:hAnsi="Cambria" w:cs="Cambria"/>
       <w:b/>
       <w:caps/>
       <w:color w:val="8A6520"/>
-      <w:sz w:val="19"/>
-      <w:spacing w:val="22"/>
+      <w:spacing w:val="24"/>
+      <w:sz w:val="21"/>
     </w:rPr>
   </w:style>
   <w:style w:type="paragraph" w:customStyle="1" w:styleId="CVProfile">
@@ -12278,7 +12333,165 @@
     <w:pPr>
       <w:keepLines/>
       <w:widowControl/>
-      <w:spacing w:before="0" w:after="0" w:line="259" w:lineRule="auto"/>
+      <w:spacing w:before="40" w:after="140" w:line="269" w:lineRule="auto"/>
+    </w:pPr>
+    <w:rPr>
+      <w:rFonts w:ascii="Calibri" w:hAnsi="Calibri" w:cs="Calibri"/>
+      <w:color w:val="1A1712"/>
+      <w:sz w:val="20"/>
+    </w:rPr>
+  </w:style>
+  <w:style w:type="paragraph" w:customStyle="1" w:styleId="CVNote">
+    <w:name w:val="CVNote"/>
+    <w:basedOn w:val="Normal"/>
+    <w:qFormat/>
+    <w:pPr>
+      <w:keepLines/>
+      <w:widowControl/>
+      <w:spacing w:before="80" w:after="0" w:line="240" w:lineRule="auto"/>
+    </w:pPr>
+    <w:rPr>
+      <w:rFonts w:ascii="Calibri" w:hAnsi="Calibri" w:cs="Calibri"/>
+      <w:i/>
+      <w:color w:val="6E6757"/>
+      <w:sz w:val="16"/>
+    </w:rPr>
+  </w:style>
+  <w:style w:type="paragraph" w:customStyle="1" w:styleId="CVPubNote">
+    <w:name w:val="CVPubNote"/>
+    <w:basedOn w:val="Normal"/>
+    <w:qFormat/>
+    <w:pPr>
+      <w:keepNext/>
+      <w:keepLines/>
+      <w:widowControl/>
+      <w:spacing w:before="0" w:after="80" w:line="240" w:lineRule="auto"/>
+    </w:pPr>
+    <w:rPr>
+      <w:rFonts w:ascii="Calibri" w:hAnsi="Calibri" w:cs="Calibri"/>
+      <w:i/>
+      <w:color w:val="6E6757"/>
+      <w:sz w:val="17"/>
+    </w:rPr>
+  </w:style>
+  <w:style w:type="paragraph" w:customStyle="1" w:styleId="CVLead">
+    <w:name w:val="CVLead"/>
+    <w:basedOn w:val="Normal"/>
+    <w:qFormat/>
+    <w:pPr>
+      <w:keepLines/>
+      <w:widowControl/>
+      <w:spacing w:before="0" w:after="60" w:line="254" w:lineRule="auto"/>
+    </w:pPr>
+    <w:rPr>
+      <w:rFonts w:ascii="Calibri" w:hAnsi="Calibri" w:cs="Calibri"/>
+      <w:i/>
+      <w:color w:val="4F493E"/>
+      <w:sz w:val="18"/>
+    </w:rPr>
+  </w:style>
+  <w:style w:type="paragraph" w:customStyle="1" w:styleId="CVSubhead">
+    <w:name w:val="CVSubhead"/>
+    <w:basedOn w:val="Normal"/>
+    <w:qFormat/>
+    <w:pPr>
+      <w:keepNext/>
+      <w:keepLines/>
+      <w:widowControl/>
+      <w:spacing w:before="200" w:after="40" w:line="240" w:lineRule="auto"/>
+    </w:pPr>
+    <w:rPr>
+      <w:rFonts w:ascii="Calibri" w:hAnsi="Calibri" w:cs="Calibri"/>
+      <w:b/>
+      <w:color w:val="1A1712"/>
+      <w:sz w:val="20"/>
+    </w:rPr>
+  </w:style>
+  <w:style w:type="paragraph" w:customStyle="1" w:styleId="CVEntry">
+    <w:name w:val="CVEntry"/>
+    <w:basedOn w:val="Normal"/>
+    <w:qFormat/>
+    <w:pPr>
+      <w:keepNext/>
+      <w:keepLines/>
+      <w:widowControl/>
+      <w:tabs>
+        <w:tab w:pos="1944" w:val="left"/>
+      </w:tabs>
+      <w:spacing w:before="140" w:after="0" w:line="240" w:lineRule="auto"/>
+      <w:ind w:left="1944" w:hanging="1944"/>
+    </w:pPr>
+    <w:rPr>
+      <w:rFonts w:ascii="Calibri" w:hAnsi="Calibri" w:cs="Calibri"/>
+      <w:b/>
+      <w:color w:val="1A1712"/>
+      <w:sz w:val="20"/>
+    </w:rPr>
+  </w:style>
+  <w:style w:type="paragraph" w:customStyle="1" w:styleId="CVEntryEnd">
+    <w:name w:val="CVEntryEnd"/>
+    <w:basedOn w:val="Normal"/>
+    <w:qFormat/>
+    <w:pPr>
+      <w:keepLines/>
+      <w:widowControl/>
+      <w:tabs>
+        <w:tab w:pos="1944" w:val="left"/>
+      </w:tabs>
+      <w:spacing w:before="140" w:after="0" w:line="240" w:lineRule="auto"/>
+      <w:ind w:left="1944" w:hanging="1944"/>
+    </w:pPr>
+    <w:rPr>
+      <w:rFonts w:ascii="Calibri" w:hAnsi="Calibri" w:cs="Calibri"/>
+      <w:b/>
+      <w:color w:val="1A1712"/>
+      <w:sz w:val="20"/>
+    </w:rPr>
+  </w:style>
+  <w:style w:type="paragraph" w:customStyle="1" w:styleId="CVMeta">
+    <w:name w:val="CVMeta"/>
+    <w:basedOn w:val="Normal"/>
+    <w:qFormat/>
+    <w:pPr>
+      <w:keepNext/>
+      <w:keepLines/>
+      <w:widowControl/>
+      <w:spacing w:before="0" w:after="0" w:line="240" w:lineRule="auto"/>
+      <w:ind w:left="1944"/>
+    </w:pPr>
+    <w:rPr>
+      <w:rFonts w:ascii="Calibri" w:hAnsi="Calibri" w:cs="Calibri"/>
+      <w:i/>
+      <w:color w:val="4F493E"/>
+      <w:sz w:val="18"/>
+    </w:rPr>
+  </w:style>
+  <w:style w:type="paragraph" w:customStyle="1" w:styleId="CVMetaEnd">
+    <w:name w:val="CVMetaEnd"/>
+    <w:basedOn w:val="Normal"/>
+    <w:qFormat/>
+    <w:pPr>
+      <w:keepLines/>
+      <w:widowControl/>
+      <w:spacing w:before="0" w:after="0" w:line="240" w:lineRule="auto"/>
+      <w:ind w:left="1944"/>
+    </w:pPr>
+    <w:rPr>
+      <w:rFonts w:ascii="Calibri" w:hAnsi="Calibri" w:cs="Calibri"/>
+      <w:i/>
+      <w:color w:val="4F493E"/>
+      <w:sz w:val="18"/>
+    </w:rPr>
+  </w:style>
+  <w:style w:type="paragraph" w:customStyle="1" w:styleId="CVBody">
+    <w:name w:val="CVBody"/>
+    <w:basedOn w:val="Normal"/>
+    <w:qFormat/>
+    <w:pPr>
+      <w:keepLines/>
+      <w:widowControl/>
+      <w:spacing w:before="30" w:after="0" w:line="254" w:lineRule="auto"/>
+      <w:ind w:left="1944"/>
     </w:pPr>
     <w:rPr>
       <w:rFonts w:ascii="Calibri" w:hAnsi="Calibri" w:cs="Calibri"/>
@@ -12286,229 +12499,94 @@
       <w:sz w:val="19"/>
     </w:rPr>
   </w:style>
-  <w:style w:type="paragraph" w:customStyle="1" w:styleId="CVMetrics">
-    <w:name w:val="CVMetrics"/>
+  <w:style w:type="paragraph" w:customStyle="1" w:styleId="CVBullet">
+    <w:name w:val="CVBullet"/>
     <w:basedOn w:val="Normal"/>
     <w:qFormat/>
     <w:pPr>
       <w:keepLines/>
       <w:widowControl/>
-      <w:spacing w:before="140" w:after="0" w:line="240" w:lineRule="auto"/>
+      <w:tabs>
+        <w:tab w:pos="2174" w:val="left"/>
+      </w:tabs>
+      <w:spacing w:before="40" w:after="0" w:line="254" w:lineRule="auto"/>
+      <w:ind w:left="2174" w:hanging="230"/>
     </w:pPr>
     <w:rPr>
       <w:rFonts w:ascii="Calibri" w:hAnsi="Calibri" w:cs="Calibri"/>
-      <w:color w:val="5A5347"/>
-      <w:sz w:val="16"/>
+      <w:color w:val="1A1712"/>
+      <w:sz w:val="19"/>
     </w:rPr>
   </w:style>
-  <w:style w:type="paragraph" w:customStyle="1" w:styleId="CVNote">
-    <w:name w:val="CVNote"/>
+  <w:style w:type="paragraph" w:customStyle="1" w:styleId="CVPub">
+    <w:name w:val="CVPub"/>
     <w:basedOn w:val="Normal"/>
     <w:qFormat/>
     <w:pPr>
       <w:keepLines/>
       <w:widowControl/>
-      <w:spacing w:before="40" w:after="0" w:line="240" w:lineRule="auto"/>
+      <w:tabs>
+        <w:tab w:pos="518" w:val="left"/>
+      </w:tabs>
+      <w:spacing w:before="80" w:after="0" w:line="250" w:lineRule="auto"/>
+      <w:ind w:left="518" w:hanging="518"/>
     </w:pPr>
     <w:rPr>
       <w:rFonts w:ascii="Calibri" w:hAnsi="Calibri" w:cs="Calibri"/>
-      <w:i/>
-      <w:color w:val="7A7263"/>
-      <w:sz w:val="16"/>
+      <w:color w:val="1A1712"/>
+      <w:sz w:val="19"/>
     </w:rPr>
   </w:style>
-  <w:style w:type="paragraph" w:customStyle="1" w:styleId="CVPubNote">
-    <w:name w:val="CVPubNote"/>
+  <w:style w:type="paragraph" w:customStyle="1" w:styleId="CVLabel">
+    <w:name w:val="CVLabel"/>
+    <w:basedOn w:val="Normal"/>
+    <w:qFormat/>
+    <w:pPr>
+      <w:keepLines/>
+      <w:widowControl/>
+      <w:tabs>
+        <w:tab w:pos="2304" w:val="left"/>
+      </w:tabs>
+      <w:spacing w:before="80" w:after="0" w:line="254" w:lineRule="auto"/>
+      <w:ind w:left="2304" w:hanging="2304"/>
+    </w:pPr>
+    <w:rPr>
+      <w:rFonts w:ascii="Calibri" w:hAnsi="Calibri" w:cs="Calibri"/>
+      <w:color w:val="1A1712"/>
+      <w:sz w:val="19"/>
+    </w:rPr>
+  </w:style>
+  <w:style w:type="paragraph" w:customStyle="1" w:styleId="CVLabelNote">
+    <w:name w:val="CVLabelNote"/>
+    <w:basedOn w:val="Normal"/>
+    <w:qFormat/>
+    <w:pPr>
+      <w:keepLines/>
+      <w:widowControl/>
+      <w:spacing w:before="40" w:after="0" w:line="252" w:lineRule="auto"/>
+      <w:ind w:left="2304"/>
+    </w:pPr>
+    <w:rPr>
+      <w:rFonts w:ascii="Calibri" w:hAnsi="Calibri" w:cs="Calibri"/>
+      <w:color w:val="4F493E"/>
+      <w:sz w:val="18"/>
+    </w:rPr>
+  </w:style>
+  <w:style w:type="paragraph" w:customStyle="1" w:styleId="CVRefName">
+    <w:name w:val="CVRefName"/>
     <w:basedOn w:val="Normal"/>
     <w:qFormat/>
     <w:pPr>
       <w:keepNext/>
       <w:keepLines/>
       <w:widowControl/>
-      <w:spacing w:before="0" w:after="100" w:line="240" w:lineRule="auto"/>
-    </w:pPr>
-    <w:rPr>
-      <w:rFonts w:ascii="Calibri" w:hAnsi="Calibri" w:cs="Calibri"/>
-      <w:i/>
-      <w:color w:val="7A7263"/>
-      <w:sz w:val="16"/>
-    </w:rPr>
-  </w:style>
-  <w:style w:type="paragraph" w:customStyle="1" w:styleId="CVLead">
-    <w:name w:val="CVLead"/>
-    <w:basedOn w:val="Normal"/>
-    <w:qFormat/>
-    <w:pPr>
-      <w:keepLines/>
-      <w:widowControl/>
-      <w:spacing w:before="0" w:after="60" w:line="240" w:lineRule="auto"/>
-    </w:pPr>
-    <w:rPr>
-      <w:rFonts w:ascii="Calibri" w:hAnsi="Calibri" w:cs="Calibri"/>
-      <w:i/>
-      <w:color w:val="5A5347"/>
-      <w:sz w:val="17"/>
-    </w:rPr>
-  </w:style>
-  <w:style w:type="paragraph" w:customStyle="1" w:styleId="CVSubhead">
-    <w:name w:val="CVSubhead"/>
-    <w:basedOn w:val="Normal"/>
-    <w:qFormat/>
-    <w:pPr>
-      <w:keepNext/>
-      <w:keepLines/>
-      <w:widowControl/>
-      <w:spacing w:before="180" w:after="20" w:line="240" w:lineRule="auto"/>
+      <w:spacing w:before="120" w:after="0" w:line="240" w:lineRule="auto"/>
     </w:pPr>
     <w:rPr>
       <w:rFonts w:ascii="Calibri" w:hAnsi="Calibri" w:cs="Calibri"/>
       <w:b/>
       <w:color w:val="1A1712"/>
-      <w:sz w:val="18"/>
-    </w:rPr>
-  </w:style>
-  <w:style w:type="paragraph" w:customStyle="1" w:styleId="CVEntry">
-    <w:name w:val="CVEntry"/>
-    <w:basedOn w:val="Normal"/>
-    <w:qFormat/>
-    <w:pPr>
-      <w:keepNext/>
-      <w:keepLines/>
-      <w:widowControl/>
-      <w:tabs>
-        <w:tab w:pos="1872" w:val="left"/>
-      </w:tabs>
-      <w:spacing w:before="120" w:after="0" w:line="240" w:lineRule="auto"/>
-      <w:ind w:left="1872" w:hanging="1872"/>
-    </w:pPr>
-    <w:rPr>
-      <w:rFonts w:ascii="Calibri" w:hAnsi="Calibri" w:cs="Calibri"/>
-      <w:b/>
-      <w:color w:val="1A1712"/>
-      <w:sz w:val="19"/>
-    </w:rPr>
-  </w:style>
-  <w:style w:type="paragraph" w:customStyle="1" w:styleId="CVMeta">
-    <w:name w:val="CVMeta"/>
-    <w:basedOn w:val="Normal"/>
-    <w:qFormat/>
-    <w:pPr>
-      <w:keepLines/>
-      <w:widowControl/>
-      <w:spacing w:before="0" w:after="0" w:line="240" w:lineRule="auto"/>
-      <w:ind w:left="1872"/>
-    </w:pPr>
-    <w:rPr>
-      <w:rFonts w:ascii="Calibri" w:hAnsi="Calibri" w:cs="Calibri"/>
-      <w:i/>
-      <w:color w:val="5A5347"/>
-      <w:sz w:val="18"/>
-    </w:rPr>
-  </w:style>
-  <w:style w:type="paragraph" w:customStyle="1" w:styleId="CVBody">
-    <w:name w:val="CVBody"/>
-    <w:basedOn w:val="Normal"/>
-    <w:qFormat/>
-    <w:pPr>
-      <w:keepLines/>
-      <w:widowControl/>
-      <w:spacing w:before="20" w:after="0" w:line="240" w:lineRule="auto"/>
-      <w:ind w:left="1872"/>
-    </w:pPr>
-    <w:rPr>
-      <w:rFonts w:ascii="Calibri" w:hAnsi="Calibri" w:cs="Calibri"/>
-      <w:color w:val="1A1712"/>
-      <w:sz w:val="18"/>
-    </w:rPr>
-  </w:style>
-  <w:style w:type="paragraph" w:customStyle="1" w:styleId="CVBullet">
-    <w:name w:val="CVBullet"/>
-    <w:basedOn w:val="Normal"/>
-    <w:qFormat/>
-    <w:pPr>
-      <w:keepLines/>
-      <w:widowControl/>
-      <w:tabs>
-        <w:tab w:pos="2102" w:val="left"/>
-      </w:tabs>
-      <w:spacing w:before="30" w:after="0" w:line="240" w:lineRule="auto"/>
-      <w:ind w:left="2102" w:hanging="230"/>
-    </w:pPr>
-    <w:rPr>
-      <w:rFonts w:ascii="Calibri" w:hAnsi="Calibri" w:cs="Calibri"/>
-      <w:color w:val="1A1712"/>
-      <w:sz w:val="18"/>
-    </w:rPr>
-  </w:style>
-  <w:style w:type="paragraph" w:customStyle="1" w:styleId="CVPub">
-    <w:name w:val="CVPub"/>
-    <w:basedOn w:val="Normal"/>
-    <w:qFormat/>
-    <w:pPr>
-      <w:keepLines/>
-      <w:widowControl/>
-      <w:tabs>
-        <w:tab w:pos="490" w:val="left"/>
-      </w:tabs>
-      <w:spacing w:before="70" w:after="0" w:line="247" w:lineRule="auto"/>
-      <w:ind w:left="490" w:hanging="490"/>
-    </w:pPr>
-    <w:rPr>
-      <w:rFonts w:ascii="Calibri" w:hAnsi="Calibri" w:cs="Calibri"/>
-      <w:color w:val="1A1712"/>
-      <w:sz w:val="18"/>
-    </w:rPr>
-  </w:style>
-  <w:style w:type="paragraph" w:customStyle="1" w:styleId="CVLabel">
-    <w:name w:val="CVLabel"/>
-    <w:basedOn w:val="Normal"/>
-    <w:qFormat/>
-    <w:pPr>
-      <w:keepLines/>
-      <w:widowControl/>
-      <w:tabs>
-        <w:tab w:pos="2232" w:val="left"/>
-      </w:tabs>
-      <w:spacing w:before="60" w:after="0" w:line="252" w:lineRule="auto"/>
-      <w:ind w:left="2232" w:hanging="2232"/>
-    </w:pPr>
-    <w:rPr>
-      <w:rFonts w:ascii="Calibri" w:hAnsi="Calibri" w:cs="Calibri"/>
-      <w:color w:val="1A1712"/>
-      <w:sz w:val="18"/>
-    </w:rPr>
-  </w:style>
-  <w:style w:type="paragraph" w:customStyle="1" w:styleId="CVLabelNote">
-    <w:name w:val="CVLabelNote"/>
-    <w:basedOn w:val="Normal"/>
-    <w:qFormat/>
-    <w:pPr>
-      <w:keepLines/>
-      <w:widowControl/>
-      <w:spacing w:before="40" w:after="0" w:line="252" w:lineRule="auto"/>
-      <w:ind w:left="2232"/>
-    </w:pPr>
-    <w:rPr>
-      <w:rFonts w:ascii="Calibri" w:hAnsi="Calibri" w:cs="Calibri"/>
-      <w:color w:val="5A5347"/>
-      <w:sz w:val="17"/>
-    </w:rPr>
-  </w:style>
-  <w:style w:type="paragraph" w:customStyle="1" w:styleId="CVRefName">
-    <w:name w:val="CVRefName"/>
-    <w:basedOn w:val="Normal"/>
-    <w:qFormat/>
-    <w:pPr>
-      <w:keepNext/>
-      <w:keepLines/>
-      <w:widowControl/>
-      <w:spacing w:before="100" w:after="0" w:line="240" w:lineRule="auto"/>
-    </w:pPr>
-    <w:rPr>
-      <w:rFonts w:ascii="Calibri" w:hAnsi="Calibri" w:cs="Calibri"/>
-      <w:b/>
-      <w:color w:val="1A1712"/>
-      <w:sz w:val="19"/>
+      <w:sz w:val="20"/>
     </w:rPr>
   </w:style>
   <w:style w:type="paragraph" w:customStyle="1" w:styleId="CVRefOrg">
@@ -12524,7 +12602,7 @@
     <w:rPr>
       <w:rFonts w:ascii="Calibri" w:hAnsi="Calibri" w:cs="Calibri"/>
       <w:i/>
-      <w:color w:val="5A5347"/>
+      <w:color w:val="4F493E"/>
       <w:sz w:val="18"/>
     </w:rPr>
   </w:style>
@@ -12534,8 +12612,8 @@
     <w:rPr>
       <w:rFonts w:ascii="Calibri" w:hAnsi="Calibri" w:cs="Calibri"/>
       <w:b/>
-      <w:color w:val="7A7263"/>
-      <w:sz w:val="17"/>
+      <w:color w:val="6E6757"/>
+      <w:sz w:val="18"/>
     </w:rPr>
   </w:style>
   <w:style w:type="character" w:customStyle="1" w:styleId="CVMe">
@@ -12552,21 +12630,11 @@
       <w:i/>
     </w:rPr>
   </w:style>
-  <w:style w:type="character" w:customStyle="1" w:styleId="CVBig">
-    <w:name w:val="CVBig"/>
-    <w:qFormat/>
-    <w:rPr>
-      <w:rFonts w:ascii="Georgia" w:hAnsi="Georgia" w:cs="Georgia"/>
-      <w:b/>
-      <w:color w:val="8A6520"/>
-      <w:sz w:val="20"/>
-    </w:rPr>
-  </w:style>
   <w:style w:type="character" w:customStyle="1" w:styleId="CVSep">
     <w:name w:val="CVSep"/>
     <w:qFormat/>
     <w:rPr>
-      <w:color w:val="C0B6A0"/>
+      <w:color w:val="B9AE94"/>
     </w:rPr>
   </w:style>
   <w:style w:type="character" w:customStyle="1" w:styleId="CVMuted">
@@ -12574,14 +12642,14 @@
     <w:qFormat/>
     <w:rPr>
       <w:b w:val="0"/>
-      <w:color w:val="5A5347"/>
+      <w:color w:val="4F493E"/>
     </w:rPr>
   </w:style>
   <w:style w:type="character" w:customStyle="1" w:styleId="CVFaint">
     <w:name w:val="CVFaint"/>
     <w:qFormat/>
     <w:rPr>
-      <w:color w:val="7A7263"/>
+      <w:color w:val="6E6757"/>
     </w:rPr>
   </w:style>
   <w:style w:type="character" w:customStyle="1" w:styleId="CVNum">
@@ -12590,8 +12658,8 @@
     <w:rPr>
       <w:rFonts w:ascii="Calibri" w:hAnsi="Calibri" w:cs="Calibri"/>
       <w:b/>
-      <w:color w:val="7A7263"/>
-      <w:sz w:val="18"/>
+      <w:color w:val="6E6757"/>
+      <w:sz w:val="19"/>
     </w:rPr>
   </w:style>
   <w:style w:type="character" w:customStyle="1" w:styleId="CVLink">
@@ -12600,7 +12668,7 @@
     <w:rPr>
       <w:rFonts w:ascii="Calibri" w:hAnsi="Calibri" w:cs="Calibri"/>
       <w:color w:val="8A6520"/>
-      <w:sz w:val="17"/>
+      <w:sz w:val="18"/>
     </w:rPr>
   </w:style>
   <w:style w:type="character" w:customStyle="1" w:styleId="Hyperlink">
@@ -12608,7 +12676,7 @@
     <w:rPr>
       <w:rFonts w:ascii="Calibri" w:hAnsi="Calibri" w:cs="Calibri"/>
       <w:color w:val="8A6520"/>
-      <w:sz w:val="17"/>
+      <w:sz w:val="18"/>
       <w:u w:val="none"/>
     </w:rPr>
   </w:style>

</xml_diff>